<commit_message>
docs: ajouter la section pile technique à la présentation fonctionnelle
Tableau des composants (Elasticsearch 9.4.3, Apache Tika 3.3.1.0,
Kafka 8.3 KRaft, Redis 7.2, Nginx 1.27, Python 3.12) avec leur rôle
respectif, plus un paragraphe sur l'architecture en plusieurs dépôts
et le déploiement via Docker Compose.
</commit_message>
<xml_diff>
--- a/docsearch_presentation_fonctionnelle.docx
+++ b/docsearch_presentation_fonctionnelle.docx
@@ -1127,6 +1127,710 @@
         <w:t xml:space="preserve">Retour sur investissement estimé × 52 sur 3 ans (détail dans la proposition de déploiement)</w:t>
       </w:r>
     </w:p>
+    <w:p>
+      <w:pPr>
+        <w:spacing w:after="120"/>
+      </w:pPr>
+    </w:p>
+    <w:p>
+      <w:pPr>
+        <w:pStyle w:val="Heading1"/>
+        <w:pBdr>
+          <w:bottom w:val="single" w:color="000091" w:sz="12" w:space="4"/>
+        </w:pBdr>
+        <w:spacing w:after="160" w:before="360"/>
+      </w:pPr>
+      <w:r>
+        <w:rPr>
+          <w:rFonts w:ascii="Arial" w:cs="Arial" w:eastAsia="Arial" w:hAnsi="Arial"/>
+          <w:b/>
+          <w:bCs/>
+          <w:color w:val="000091"/>
+          <w:sz w:val="30"/>
+          <w:szCs w:val="30"/>
+        </w:rPr>
+        <w:t xml:space="preserve">Pile technique</w:t>
+      </w:r>
+    </w:p>
+    <w:p>
+      <w:pPr>
+        <w:spacing w:after="140"/>
+      </w:pPr>
+      <w:r>
+        <w:rPr>
+          <w:rFonts w:ascii="Arial" w:cs="Arial" w:eastAsia="Arial" w:hAnsi="Arial"/>
+          <w:color w:val="161616"/>
+          <w:sz w:val="21"/>
+          <w:szCs w:val="21"/>
+        </w:rPr>
+        <w:t xml:space="preserve">Chaque composant a un rôle précis dans la chaîne d'indexation et de recherche — tous open source, sans coût de licence.</w:t>
+      </w:r>
+    </w:p>
+    <w:p>
+      <w:pPr>
+        <w:spacing w:after="80"/>
+      </w:pPr>
+    </w:p>
+    <w:tbl>
+      <w:tblPr>
+        <w:tblW w:type="pct" w:w="100%"/>
+        <w:tblBorders>
+          <w:top w:val="single" w:color="auto" w:sz="4"/>
+          <w:left w:val="single" w:color="auto" w:sz="4"/>
+          <w:bottom w:val="single" w:color="auto" w:sz="4"/>
+          <w:right w:val="single" w:color="auto" w:sz="4"/>
+          <w:insideH w:val="single" w:color="auto" w:sz="4"/>
+          <w:insideV w:val="single" w:color="auto" w:sz="4"/>
+        </w:tblBorders>
+      </w:tblPr>
+      <w:tblGrid>
+        <w:gridCol w:w="2800"/>
+        <w:gridCol w:w="4200"/>
+        <w:gridCol w:w="2200"/>
+      </w:tblGrid>
+      <w:tr>
+        <w:tc>
+          <w:tcPr>
+            <w:tcW w:type="dxa" w:w="2800"/>
+            <w:shd w:fill="000091" w:val="clear"/>
+            <w:tcMar>
+              <w:top w:type="dxa" w:w="100"/>
+              <w:left w:type="dxa" w:w="120"/>
+              <w:bottom w:type="dxa" w:w="100"/>
+              <w:right w:type="dxa" w:w="120"/>
+            </w:tcMar>
+          </w:tcPr>
+          <w:p>
+            <w:r>
+              <w:rPr>
+                <w:rFonts w:ascii="Arial" w:cs="Arial" w:eastAsia="Arial" w:hAnsi="Arial"/>
+                <w:b/>
+                <w:bCs/>
+                <w:color w:val="FFFFFF"/>
+                <w:sz w:val="19"/>
+                <w:szCs w:val="19"/>
+              </w:rPr>
+              <w:t xml:space="preserve">Composant</w:t>
+            </w:r>
+          </w:p>
+        </w:tc>
+        <w:tc>
+          <w:tcPr>
+            <w:tcW w:type="dxa" w:w="4200"/>
+            <w:shd w:fill="000091" w:val="clear"/>
+            <w:tcMar>
+              <w:top w:type="dxa" w:w="100"/>
+              <w:left w:type="dxa" w:w="120"/>
+              <w:bottom w:type="dxa" w:w="100"/>
+              <w:right w:type="dxa" w:w="120"/>
+            </w:tcMar>
+          </w:tcPr>
+          <w:p>
+            <w:r>
+              <w:rPr>
+                <w:rFonts w:ascii="Arial" w:cs="Arial" w:eastAsia="Arial" w:hAnsi="Arial"/>
+                <w:b/>
+                <w:bCs/>
+                <w:color w:val="FFFFFF"/>
+                <w:sz w:val="19"/>
+                <w:szCs w:val="19"/>
+              </w:rPr>
+              <w:t xml:space="preserve">Rôle</w:t>
+            </w:r>
+          </w:p>
+        </w:tc>
+        <w:tc>
+          <w:tcPr>
+            <w:tcW w:type="dxa" w:w="2200"/>
+            <w:shd w:fill="000091" w:val="clear"/>
+            <w:tcMar>
+              <w:top w:type="dxa" w:w="100"/>
+              <w:left w:type="dxa" w:w="120"/>
+              <w:bottom w:type="dxa" w:w="100"/>
+              <w:right w:type="dxa" w:w="120"/>
+            </w:tcMar>
+          </w:tcPr>
+          <w:p>
+            <w:r>
+              <w:rPr>
+                <w:rFonts w:ascii="Arial" w:cs="Arial" w:eastAsia="Arial" w:hAnsi="Arial"/>
+                <w:b/>
+                <w:bCs/>
+                <w:color w:val="FFFFFF"/>
+                <w:sz w:val="19"/>
+                <w:szCs w:val="19"/>
+              </w:rPr>
+              <w:t xml:space="preserve">Version</w:t>
+            </w:r>
+          </w:p>
+        </w:tc>
+      </w:tr>
+      <w:tr>
+        <w:tc>
+          <w:tcPr>
+            <w:tcW w:type="dxa" w:w="2800"/>
+            <w:shd w:fill="FFFFFF" w:val="clear"/>
+            <w:tcMar>
+              <w:top w:type="dxa" w:w="100"/>
+              <w:left w:type="dxa" w:w="120"/>
+              <w:bottom w:type="dxa" w:w="100"/>
+              <w:right w:type="dxa" w:w="120"/>
+            </w:tcMar>
+          </w:tcPr>
+          <w:p>
+            <w:r>
+              <w:rPr>
+                <w:rFonts w:ascii="Arial" w:cs="Arial" w:eastAsia="Arial" w:hAnsi="Arial"/>
+                <w:b w:val="false"/>
+                <w:bCs w:val="false"/>
+                <w:color w:val="161616"/>
+                <w:sz w:val="19"/>
+                <w:szCs w:val="19"/>
+              </w:rPr>
+              <w:t xml:space="preserve">Elasticsearch</w:t>
+            </w:r>
+          </w:p>
+        </w:tc>
+        <w:tc>
+          <w:tcPr>
+            <w:tcW w:type="dxa" w:w="4200"/>
+            <w:shd w:fill="FFFFFF" w:val="clear"/>
+            <w:tcMar>
+              <w:top w:type="dxa" w:w="100"/>
+              <w:left w:type="dxa" w:w="120"/>
+              <w:bottom w:type="dxa" w:w="100"/>
+              <w:right w:type="dxa" w:w="120"/>
+            </w:tcMar>
+          </w:tcPr>
+          <w:p>
+            <w:r>
+              <w:rPr>
+                <w:rFonts w:ascii="Arial" w:cs="Arial" w:eastAsia="Arial" w:hAnsi="Arial"/>
+                <w:b w:val="false"/>
+                <w:bCs w:val="false"/>
+                <w:color w:val="161616"/>
+                <w:sz w:val="19"/>
+                <w:szCs w:val="19"/>
+              </w:rPr>
+              <w:t xml:space="preserve">Indexation et recherche plein texte</w:t>
+            </w:r>
+          </w:p>
+        </w:tc>
+        <w:tc>
+          <w:tcPr>
+            <w:tcW w:type="dxa" w:w="2200"/>
+            <w:shd w:fill="FFFFFF" w:val="clear"/>
+            <w:tcMar>
+              <w:top w:type="dxa" w:w="100"/>
+              <w:left w:type="dxa" w:w="120"/>
+              <w:bottom w:type="dxa" w:w="100"/>
+              <w:right w:type="dxa" w:w="120"/>
+            </w:tcMar>
+          </w:tcPr>
+          <w:p>
+            <w:r>
+              <w:rPr>
+                <w:rFonts w:ascii="Arial" w:cs="Arial" w:eastAsia="Arial" w:hAnsi="Arial"/>
+                <w:b w:val="false"/>
+                <w:bCs w:val="false"/>
+                <w:color w:val="161616"/>
+                <w:sz w:val="19"/>
+                <w:szCs w:val="19"/>
+              </w:rPr>
+              <w:t xml:space="preserve">9.4.3</w:t>
+            </w:r>
+          </w:p>
+        </w:tc>
+      </w:tr>
+      <w:tr>
+        <w:tc>
+          <w:tcPr>
+            <w:tcW w:type="dxa" w:w="2800"/>
+            <w:shd w:fill="FFFFFF" w:val="clear"/>
+            <w:tcMar>
+              <w:top w:type="dxa" w:w="100"/>
+              <w:left w:type="dxa" w:w="120"/>
+              <w:bottom w:type="dxa" w:w="100"/>
+              <w:right w:type="dxa" w:w="120"/>
+            </w:tcMar>
+          </w:tcPr>
+          <w:p>
+            <w:r>
+              <w:rPr>
+                <w:rFonts w:ascii="Arial" w:cs="Arial" w:eastAsia="Arial" w:hAnsi="Arial"/>
+                <w:b w:val="false"/>
+                <w:bCs w:val="false"/>
+                <w:color w:val="161616"/>
+                <w:sz w:val="19"/>
+                <w:szCs w:val="19"/>
+              </w:rPr>
+              <w:t xml:space="preserve">Apache Tika</w:t>
+            </w:r>
+          </w:p>
+        </w:tc>
+        <w:tc>
+          <w:tcPr>
+            <w:tcW w:type="dxa" w:w="4200"/>
+            <w:shd w:fill="FFFFFF" w:val="clear"/>
+            <w:tcMar>
+              <w:top w:type="dxa" w:w="100"/>
+              <w:left w:type="dxa" w:w="120"/>
+              <w:bottom w:type="dxa" w:w="100"/>
+              <w:right w:type="dxa" w:w="120"/>
+            </w:tcMar>
+          </w:tcPr>
+          <w:p>
+            <w:r>
+              <w:rPr>
+                <w:rFonts w:ascii="Arial" w:cs="Arial" w:eastAsia="Arial" w:hAnsi="Arial"/>
+                <w:b w:val="false"/>
+                <w:bCs w:val="false"/>
+                <w:color w:val="161616"/>
+                <w:sz w:val="19"/>
+                <w:szCs w:val="19"/>
+              </w:rPr>
+              <w:t xml:space="preserve">Extraction de contenu et métadonnées (×4 instances)</w:t>
+            </w:r>
+          </w:p>
+        </w:tc>
+        <w:tc>
+          <w:tcPr>
+            <w:tcW w:type="dxa" w:w="2200"/>
+            <w:shd w:fill="FFFFFF" w:val="clear"/>
+            <w:tcMar>
+              <w:top w:type="dxa" w:w="100"/>
+              <w:left w:type="dxa" w:w="120"/>
+              <w:bottom w:type="dxa" w:w="100"/>
+              <w:right w:type="dxa" w:w="120"/>
+            </w:tcMar>
+          </w:tcPr>
+          <w:p>
+            <w:r>
+              <w:rPr>
+                <w:rFonts w:ascii="Arial" w:cs="Arial" w:eastAsia="Arial" w:hAnsi="Arial"/>
+                <w:b w:val="false"/>
+                <w:bCs w:val="false"/>
+                <w:color w:val="161616"/>
+                <w:sz w:val="19"/>
+                <w:szCs w:val="19"/>
+              </w:rPr>
+              <w:t xml:space="preserve">3.3.1.0</w:t>
+            </w:r>
+          </w:p>
+        </w:tc>
+      </w:tr>
+      <w:tr>
+        <w:tc>
+          <w:tcPr>
+            <w:tcW w:type="dxa" w:w="2800"/>
+            <w:shd w:fill="FFFFFF" w:val="clear"/>
+            <w:tcMar>
+              <w:top w:type="dxa" w:w="100"/>
+              <w:left w:type="dxa" w:w="120"/>
+              <w:bottom w:type="dxa" w:w="100"/>
+              <w:right w:type="dxa" w:w="120"/>
+            </w:tcMar>
+          </w:tcPr>
+          <w:p>
+            <w:r>
+              <w:rPr>
+                <w:rFonts w:ascii="Arial" w:cs="Arial" w:eastAsia="Arial" w:hAnsi="Arial"/>
+                <w:b w:val="false"/>
+                <w:bCs w:val="false"/>
+                <w:color w:val="161616"/>
+                <w:sz w:val="19"/>
+                <w:szCs w:val="19"/>
+              </w:rPr>
+              <w:t xml:space="preserve">Kafka (KRaft)</w:t>
+            </w:r>
+          </w:p>
+        </w:tc>
+        <w:tc>
+          <w:tcPr>
+            <w:tcW w:type="dxa" w:w="4200"/>
+            <w:shd w:fill="FFFFFF" w:val="clear"/>
+            <w:tcMar>
+              <w:top w:type="dxa" w:w="100"/>
+              <w:left w:type="dxa" w:w="120"/>
+              <w:bottom w:type="dxa" w:w="100"/>
+              <w:right w:type="dxa" w:w="120"/>
+            </w:tcMar>
+          </w:tcPr>
+          <w:p>
+            <w:r>
+              <w:rPr>
+                <w:rFonts w:ascii="Arial" w:cs="Arial" w:eastAsia="Arial" w:hAnsi="Arial"/>
+                <w:b w:val="false"/>
+                <w:bCs w:val="false"/>
+                <w:color w:val="161616"/>
+                <w:sz w:val="19"/>
+                <w:szCs w:val="19"/>
+              </w:rPr>
+              <w:t xml:space="preserve">File de messages pour l'indexation parallélisée — sans Zookeeper</w:t>
+            </w:r>
+          </w:p>
+        </w:tc>
+        <w:tc>
+          <w:tcPr>
+            <w:tcW w:type="dxa" w:w="2200"/>
+            <w:shd w:fill="FFFFFF" w:val="clear"/>
+            <w:tcMar>
+              <w:top w:type="dxa" w:w="100"/>
+              <w:left w:type="dxa" w:w="120"/>
+              <w:bottom w:type="dxa" w:w="100"/>
+              <w:right w:type="dxa" w:w="120"/>
+            </w:tcMar>
+          </w:tcPr>
+          <w:p>
+            <w:r>
+              <w:rPr>
+                <w:rFonts w:ascii="Arial" w:cs="Arial" w:eastAsia="Arial" w:hAnsi="Arial"/>
+                <w:b w:val="false"/>
+                <w:bCs w:val="false"/>
+                <w:color w:val="161616"/>
+                <w:sz w:val="19"/>
+                <w:szCs w:val="19"/>
+              </w:rPr>
+              <w:t xml:space="preserve">8.3</w:t>
+            </w:r>
+          </w:p>
+        </w:tc>
+      </w:tr>
+      <w:tr>
+        <w:tc>
+          <w:tcPr>
+            <w:tcW w:type="dxa" w:w="2800"/>
+            <w:shd w:fill="FFFFFF" w:val="clear"/>
+            <w:tcMar>
+              <w:top w:type="dxa" w:w="100"/>
+              <w:left w:type="dxa" w:w="120"/>
+              <w:bottom w:type="dxa" w:w="100"/>
+              <w:right w:type="dxa" w:w="120"/>
+            </w:tcMar>
+          </w:tcPr>
+          <w:p>
+            <w:r>
+              <w:rPr>
+                <w:rFonts w:ascii="Arial" w:cs="Arial" w:eastAsia="Arial" w:hAnsi="Arial"/>
+                <w:b w:val="false"/>
+                <w:bCs w:val="false"/>
+                <w:color w:val="161616"/>
+                <w:sz w:val="19"/>
+                <w:szCs w:val="19"/>
+              </w:rPr>
+              <w:t xml:space="preserve">Redis</w:t>
+            </w:r>
+          </w:p>
+        </w:tc>
+        <w:tc>
+          <w:tcPr>
+            <w:tcW w:type="dxa" w:w="4200"/>
+            <w:shd w:fill="FFFFFF" w:val="clear"/>
+            <w:tcMar>
+              <w:top w:type="dxa" w:w="100"/>
+              <w:left w:type="dxa" w:w="120"/>
+              <w:bottom w:type="dxa" w:w="100"/>
+              <w:right w:type="dxa" w:w="120"/>
+            </w:tcMar>
+          </w:tcPr>
+          <w:p>
+            <w:r>
+              <w:rPr>
+                <w:rFonts w:ascii="Arial" w:cs="Arial" w:eastAsia="Arial" w:hAnsi="Arial"/>
+                <w:b w:val="false"/>
+                <w:bCs w:val="false"/>
+                <w:color w:val="161616"/>
+                <w:sz w:val="19"/>
+                <w:szCs w:val="19"/>
+              </w:rPr>
+              <w:t xml:space="preserve">Configuration modifiable à chaud, cache</w:t>
+            </w:r>
+          </w:p>
+        </w:tc>
+        <w:tc>
+          <w:tcPr>
+            <w:tcW w:type="dxa" w:w="2200"/>
+            <w:shd w:fill="FFFFFF" w:val="clear"/>
+            <w:tcMar>
+              <w:top w:type="dxa" w:w="100"/>
+              <w:left w:type="dxa" w:w="120"/>
+              <w:bottom w:type="dxa" w:w="100"/>
+              <w:right w:type="dxa" w:w="120"/>
+            </w:tcMar>
+          </w:tcPr>
+          <w:p>
+            <w:r>
+              <w:rPr>
+                <w:rFonts w:ascii="Arial" w:cs="Arial" w:eastAsia="Arial" w:hAnsi="Arial"/>
+                <w:b w:val="false"/>
+                <w:bCs w:val="false"/>
+                <w:color w:val="161616"/>
+                <w:sz w:val="19"/>
+                <w:szCs w:val="19"/>
+              </w:rPr>
+              <w:t xml:space="preserve">7.2</w:t>
+            </w:r>
+          </w:p>
+        </w:tc>
+      </w:tr>
+      <w:tr>
+        <w:tc>
+          <w:tcPr>
+            <w:tcW w:type="dxa" w:w="2800"/>
+            <w:shd w:fill="FFFFFF" w:val="clear"/>
+            <w:tcMar>
+              <w:top w:type="dxa" w:w="100"/>
+              <w:left w:type="dxa" w:w="120"/>
+              <w:bottom w:type="dxa" w:w="100"/>
+              <w:right w:type="dxa" w:w="120"/>
+            </w:tcMar>
+          </w:tcPr>
+          <w:p>
+            <w:r>
+              <w:rPr>
+                <w:rFonts w:ascii="Arial" w:cs="Arial" w:eastAsia="Arial" w:hAnsi="Arial"/>
+                <w:b w:val="false"/>
+                <w:bCs w:val="false"/>
+                <w:color w:val="161616"/>
+                <w:sz w:val="19"/>
+                <w:szCs w:val="19"/>
+              </w:rPr>
+              <w:t xml:space="preserve">Nginx</w:t>
+            </w:r>
+          </w:p>
+        </w:tc>
+        <w:tc>
+          <w:tcPr>
+            <w:tcW w:type="dxa" w:w="4200"/>
+            <w:shd w:fill="FFFFFF" w:val="clear"/>
+            <w:tcMar>
+              <w:top w:type="dxa" w:w="100"/>
+              <w:left w:type="dxa" w:w="120"/>
+              <w:bottom w:type="dxa" w:w="100"/>
+              <w:right w:type="dxa" w:w="120"/>
+            </w:tcMar>
+          </w:tcPr>
+          <w:p>
+            <w:r>
+              <w:rPr>
+                <w:rFonts w:ascii="Arial" w:cs="Arial" w:eastAsia="Arial" w:hAnsi="Arial"/>
+                <w:b w:val="false"/>
+                <w:bCs w:val="false"/>
+                <w:color w:val="161616"/>
+                <w:sz w:val="19"/>
+                <w:szCs w:val="19"/>
+              </w:rPr>
+              <w:t xml:space="preserve">Reverse proxy, terminaison SSL</w:t>
+            </w:r>
+          </w:p>
+        </w:tc>
+        <w:tc>
+          <w:tcPr>
+            <w:tcW w:type="dxa" w:w="2200"/>
+            <w:shd w:fill="FFFFFF" w:val="clear"/>
+            <w:tcMar>
+              <w:top w:type="dxa" w:w="100"/>
+              <w:left w:type="dxa" w:w="120"/>
+              <w:bottom w:type="dxa" w:w="100"/>
+              <w:right w:type="dxa" w:w="120"/>
+            </w:tcMar>
+          </w:tcPr>
+          <w:p>
+            <w:r>
+              <w:rPr>
+                <w:rFonts w:ascii="Arial" w:cs="Arial" w:eastAsia="Arial" w:hAnsi="Arial"/>
+                <w:b w:val="false"/>
+                <w:bCs w:val="false"/>
+                <w:color w:val="161616"/>
+                <w:sz w:val="19"/>
+                <w:szCs w:val="19"/>
+              </w:rPr>
+              <w:t xml:space="preserve">1.27</w:t>
+            </w:r>
+          </w:p>
+        </w:tc>
+      </w:tr>
+      <w:tr>
+        <w:tc>
+          <w:tcPr>
+            <w:tcW w:type="dxa" w:w="2800"/>
+            <w:shd w:fill="FFFFFF" w:val="clear"/>
+            <w:tcMar>
+              <w:top w:type="dxa" w:w="100"/>
+              <w:left w:type="dxa" w:w="120"/>
+              <w:bottom w:type="dxa" w:w="100"/>
+              <w:right w:type="dxa" w:w="120"/>
+            </w:tcMar>
+          </w:tcPr>
+          <w:p>
+            <w:r>
+              <w:rPr>
+                <w:rFonts w:ascii="Arial" w:cs="Arial" w:eastAsia="Arial" w:hAnsi="Arial"/>
+                <w:b w:val="false"/>
+                <w:bCs w:val="false"/>
+                <w:color w:val="161616"/>
+                <w:sz w:val="19"/>
+                <w:szCs w:val="19"/>
+              </w:rPr>
+              <w:t xml:space="preserve">Python</w:t>
+            </w:r>
+          </w:p>
+        </w:tc>
+        <w:tc>
+          <w:tcPr>
+            <w:tcW w:type="dxa" w:w="4200"/>
+            <w:shd w:fill="FFFFFF" w:val="clear"/>
+            <w:tcMar>
+              <w:top w:type="dxa" w:w="100"/>
+              <w:left w:type="dxa" w:w="120"/>
+              <w:bottom w:type="dxa" w:w="100"/>
+              <w:right w:type="dxa" w:w="120"/>
+            </w:tcMar>
+          </w:tcPr>
+          <w:p>
+            <w:r>
+              <w:rPr>
+                <w:rFonts w:ascii="Arial" w:cs="Arial" w:eastAsia="Arial" w:hAnsi="Arial"/>
+                <w:b w:val="false"/>
+                <w:bCs w:val="false"/>
+                <w:color w:val="161616"/>
+                <w:sz w:val="19"/>
+                <w:szCs w:val="19"/>
+              </w:rPr>
+              <w:t xml:space="preserve">Ingestion, API de recherche</w:t>
+            </w:r>
+          </w:p>
+        </w:tc>
+        <w:tc>
+          <w:tcPr>
+            <w:tcW w:type="dxa" w:w="2200"/>
+            <w:shd w:fill="FFFFFF" w:val="clear"/>
+            <w:tcMar>
+              <w:top w:type="dxa" w:w="100"/>
+              <w:left w:type="dxa" w:w="120"/>
+              <w:bottom w:type="dxa" w:w="100"/>
+              <w:right w:type="dxa" w:w="120"/>
+            </w:tcMar>
+          </w:tcPr>
+          <w:p>
+            <w:r>
+              <w:rPr>
+                <w:rFonts w:ascii="Arial" w:cs="Arial" w:eastAsia="Arial" w:hAnsi="Arial"/>
+                <w:b w:val="false"/>
+                <w:bCs w:val="false"/>
+                <w:color w:val="161616"/>
+                <w:sz w:val="19"/>
+                <w:szCs w:val="19"/>
+              </w:rPr>
+              <w:t xml:space="preserve">3.12</w:t>
+            </w:r>
+          </w:p>
+        </w:tc>
+      </w:tr>
+    </w:tbl>
+    <w:p>
+      <w:pPr>
+        <w:spacing w:after="120"/>
+      </w:pPr>
+    </w:p>
+    <w:p>
+      <w:pPr>
+        <w:pStyle w:val="Heading2"/>
+        <w:spacing w:after="120" w:before="260"/>
+      </w:pPr>
+      <w:r>
+        <w:rPr>
+          <w:rFonts w:ascii="Arial" w:cs="Arial" w:eastAsia="Arial" w:hAnsi="Arial"/>
+          <w:b/>
+          <w:bCs/>
+          <w:color w:val="161616"/>
+          <w:sz w:val="24"/>
+          <w:szCs w:val="24"/>
+        </w:rPr>
+        <w:t xml:space="preserve">Architecture en plusieurs dépôts</w:t>
+      </w:r>
+    </w:p>
+    <w:p>
+      <w:pPr>
+        <w:spacing w:after="140"/>
+      </w:pPr>
+      <w:r>
+        <w:rPr>
+          <w:rFonts w:ascii="Arial" w:cs="Arial" w:eastAsia="Arial" w:hAnsi="Arial"/>
+          <w:color w:val="161616"/>
+          <w:sz w:val="21"/>
+          <w:szCs w:val="21"/>
+        </w:rPr>
+        <w:t xml:space="preserve">Le projet est découpé en dépôts indépendants (ingestion, API de recherche, interface web, orchestration, documentation) plutôt qu'un seul bloc monolithique — chacun peut évoluer, être testé et redéployé séparément, sans recharger l'ensemble du système à chaque modification.</w:t>
+      </w:r>
+    </w:p>
+    <w:p>
+      <w:pPr>
+        <w:spacing w:after="80"/>
+      </w:pPr>
+    </w:p>
+    <w:tbl>
+      <w:tblPr>
+        <w:tblW w:type="pct" w:w="100%"/>
+        <w:tblBorders>
+          <w:top w:val="single" w:color="auto" w:sz="4"/>
+          <w:left w:val="single" w:color="auto" w:sz="4"/>
+          <w:bottom w:val="single" w:color="auto" w:sz="4"/>
+          <w:right w:val="single" w:color="auto" w:sz="4"/>
+          <w:insideH w:val="single" w:color="auto" w:sz="4"/>
+          <w:insideV w:val="single" w:color="auto" w:sz="4"/>
+        </w:tblBorders>
+      </w:tblPr>
+      <w:tblGrid>
+        <w:gridCol w:w="100"/>
+      </w:tblGrid>
+      <w:tr>
+        <w:tc>
+          <w:tcPr>
+            <w:tcBorders>
+              <w:top w:val="single" w:color="18753C" w:sz="4"/>
+              <w:left w:val="single" w:color="18753C" w:sz="4"/>
+              <w:bottom w:val="single" w:color="18753C" w:sz="4"/>
+              <w:right w:val="single" w:color="18753C" w:sz="4"/>
+            </w:tcBorders>
+            <w:shd w:fill="DFFEE6" w:val="clear"/>
+            <w:tcMar>
+              <w:top w:type="dxa" w:w="160"/>
+              <w:left w:type="dxa" w:w="200"/>
+              <w:bottom w:type="dxa" w:w="160"/>
+              <w:right w:type="dxa" w:w="200"/>
+            </w:tcMar>
+          </w:tcPr>
+          <w:p>
+            <w:pPr>
+              <w:spacing w:after="60"/>
+            </w:pPr>
+            <w:r>
+              <w:rPr>
+                <w:rFonts w:ascii="Arial" w:cs="Arial" w:eastAsia="Arial" w:hAnsi="Arial"/>
+                <w:b/>
+                <w:bCs/>
+                <w:color w:val="18753C"/>
+                <w:sz w:val="21"/>
+                <w:szCs w:val="21"/>
+              </w:rPr>
+              <w:t xml:space="preserve">🐳 Déploiement</w:t>
+            </w:r>
+          </w:p>
+          <w:p>
+            <w:r>
+              <w:rPr>
+                <w:rFonts w:ascii="Arial" w:cs="Arial" w:eastAsia="Arial" w:hAnsi="Arial"/>
+                <w:color w:val="18753C"/>
+                <w:sz w:val="20"/>
+                <w:szCs w:val="20"/>
+              </w:rPr>
+              <w:t xml:space="preserve">Conteneurs Docker orchestrés via Docker Compose, avec des profils dédiés pour le développement (nœud unique) et la production (cluster à plusieurs nœuds).</w:t>
+            </w:r>
+          </w:p>
+        </w:tc>
+      </w:tr>
+    </w:tbl>
     <w:p>
       <w:pPr>
         <w:spacing w:after="120"/>

</xml_diff>

<commit_message>
docs: statistiques d'usage et ventilation par service
Deux points ajoutés à la section Administration de la présentation
fonctionnelle : les statistiques d'usage, qui n'y figuraient pas du
tout, et leur ventilation par groupe d'utilisateurs.

Co-Authored-By: Claude Opus 5 <noreply@anthropic.com>
</commit_message>
<xml_diff>
--- a/docsearch_presentation_fonctionnelle.docx
+++ b/docsearch_presentation_fonctionnelle.docx
@@ -894,6 +894,44 @@
           <w:szCs w:val="21"/>
         </w:rPr>
         <w:t xml:space="preserve">Métriques d'indexation : documents indexés, taille de l'index, répartition par type</w:t>
+      </w:r>
+    </w:p>
+    <w:p>
+      <w:pPr>
+        <w:pStyle w:val="ListParagraph"/>
+        <w:numPr>
+          <w:ilvl w:val="0"/>
+          <w:numId w:val="2"/>
+        </w:numPr>
+        <w:spacing w:after="80"/>
+      </w:pPr>
+      <w:r>
+        <w:rPr>
+          <w:rFonts w:ascii="Arial" w:cs="Arial" w:eastAsia="Arial" w:hAnsi="Arial"/>
+          <w:color w:val="161616"/>
+          <w:sz w:val="21"/>
+          <w:szCs w:val="21"/>
+        </w:rPr>
+        <w:t>Statistiques d'usage : volumétrie des recherches, requêtes les plus fréquentes, recherches restées sans résultat, satisfaction (avis et score NPS)</w:t>
+      </w:r>
+    </w:p>
+    <w:p>
+      <w:pPr>
+        <w:pStyle w:val="ListParagraph"/>
+        <w:numPr>
+          <w:ilvl w:val="0"/>
+          <w:numId w:val="2"/>
+        </w:numPr>
+        <w:spacing w:after="80"/>
+      </w:pPr>
+      <w:r>
+        <w:rPr>
+          <w:rFonts w:ascii="Arial" w:cs="Arial" w:eastAsia="Arial" w:hAnsi="Arial"/>
+          <w:color w:val="161616"/>
+          <w:sz w:val="21"/>
+          <w:szCs w:val="21"/>
+        </w:rPr>
+        <w:t>Ventilation par service : recherches, avis et satisfaction sont aussi présentés par groupe d'utilisateurs, ce qui permet de distinguer une insatisfaction générale d'une difficulté propre à un bureau</w:t>
       </w:r>
     </w:p>
     <w:p>

</xml_diff>